<commit_message>
Aligned daily orders and visual strucure
</commit_message>
<xml_diff>
--- a/Described_plan_app_suerte_cafe.docx
+++ b/Described_plan_app_suerte_cafe.docx
@@ -1401,6 +1401,118 @@
         <w:t>The database should still maintain a permanent unique identifier for every order.</w:t>
       </w:r>
     </w:p>
+    <w:p>
+      <w:pPr>
+        <w:spacing w:before="240" w:beforeAutospacing="off" w:after="240" w:afterAutospacing="off"/>
+      </w:pPr>
+      <w:r>
+        <w:t>The application must maintain two separate order identifiers:</w:t>
+      </w:r>
+    </w:p>
+    <w:p>
+      <w:pPr>
+        <w:pStyle w:val="ListParagraph"/>
+        <w:numPr>
+          <w:ilvl w:val="0"/>
+          <w:numId w:val="78"/>
+        </w:numPr>
+        <w:spacing w:before="240" w:beforeAutospacing="off" w:after="240" w:afterAutospacing="off"/>
+        <w:rPr>
+          <w:rFonts w:ascii="Arial" w:hAnsi="Arial" w:eastAsia="Arial" w:cs="Arial"/>
+          <w:noProof w:val="0"/>
+          <w:sz w:val="24"/>
+          <w:szCs w:val="24"/>
+          <w:lang w:val="en-US"/>
+        </w:rPr>
+      </w:pPr>
+      <w:r>
+        <w:t>daily_number: the visible Order Number used by employees and customers. It must be displayed as #001, #002, #003, and so on; increase sequentially during the operating day; reset to #001 at the start of each new operating day; and only needs to be unique together with the operating date.</w:t>
+      </w:r>
+    </w:p>
+    <w:p>
+      <w:pPr>
+        <w:pStyle w:val="ListParagraph"/>
+        <w:numPr>
+          <w:ilvl w:val="0"/>
+          <w:numId w:val="78"/>
+        </w:numPr>
+        <w:spacing w:before="240" w:beforeAutospacing="off" w:after="240" w:afterAutospacing="off"/>
+        <w:rPr>
+          <w:rFonts w:ascii="Arial" w:hAnsi="Arial" w:eastAsia="Arial" w:cs="Arial"/>
+          <w:noProof w:val="0"/>
+          <w:sz w:val="24"/>
+          <w:szCs w:val="24"/>
+          <w:lang w:val="en-US"/>
+        </w:rPr>
+      </w:pPr>
+      <w:r>
+        <w:t>Order.id: the permanent internal global database identifier. It never resets between operating days and continues increasing throughout the life of the application. It must not be confused with the visible daily Order Number.</w:t>
+      </w:r>
+    </w:p>
+    <w:p>
+      <w:pPr>
+        <w:spacing w:before="240" w:beforeAutospacing="off" w:after="240" w:afterAutospacing="off"/>
+      </w:pPr>
+      <w:r>
+        <w:t>The permanent internal database ID acts as the global order identifier. It increases across all operating days and never resets. It remains separate from the visible daily Order Number.</w:t>
+      </w:r>
+    </w:p>
+    <w:p>
+      <w:pPr>
+        <w:spacing w:before="240" w:beforeAutospacing="off" w:after="240" w:afterAutospacing="off"/>
+      </w:pPr>
+      <w:r>
+        <w:t>Conceptual example:</w:t>
+      </w:r>
+    </w:p>
+    <w:p>
+      <w:pPr>
+        <w:spacing w:before="240" w:beforeAutospacing="off" w:after="240" w:afterAutospacing="off"/>
+      </w:pPr>
+      <w:r>
+        <w:t>Day 1:</w:t>
+      </w:r>
+    </w:p>
+    <w:p>
+      <w:pPr>
+        <w:spacing w:before="240" w:beforeAutospacing="off" w:after="240" w:afterAutospacing="off"/>
+      </w:pPr>
+      <w:r>
+        <w:t>Visible numbers: #001 through #010</w:t>
+      </w:r>
+    </w:p>
+    <w:p>
+      <w:pPr>
+        <w:spacing w:before="240" w:beforeAutospacing="off" w:after="240" w:afterAutospacing="off"/>
+      </w:pPr>
+      <w:r>
+        <w:t>Internal global IDs: 1 through 10</w:t>
+      </w:r>
+    </w:p>
+    <w:p>
+      <w:pPr>
+        <w:spacing w:before="240" w:beforeAutospacing="off" w:after="240" w:afterAutospacing="off"/>
+      </w:pPr>
+      <w:r>
+        <w:t>Day 2:</w:t>
+      </w:r>
+    </w:p>
+    <w:p>
+      <w:pPr>
+        <w:spacing w:before="240" w:beforeAutospacing="off" w:after="240" w:afterAutospacing="off"/>
+      </w:pPr>
+      <w:r>
+        <w:t>Visible numbers: #001 through #045</w:t>
+      </w:r>
+    </w:p>
+    <w:p>
+      <w:pPr>
+        <w:spacing w:before="240" w:beforeAutospacing="off" w:after="240" w:afterAutospacing="off"/>
+      </w:pPr>
+      <w:r>
+        <w:t>Internal global IDs: 11 through 55</w:t>
+      </w:r>
+    </w:p>
     <w:p/>
     <w:p>
       <w:pPr>
@@ -1820,14 +1932,7 @@
         </w:rPr>
       </w:pPr>
       <w:r>
-        <w:rPr>
-          <w:rFonts w:ascii="Arial" w:hAnsi="Arial" w:eastAsia="Arial" w:cs="Arial"/>
-          <w:noProof w:val="0"/>
-          <w:sz w:val="24"/>
-          <w:szCs w:val="24"/>
-          <w:lang w:val="en-US"/>
-        </w:rPr>
-        <w:t>Neighborhood.</w:t>
+        <w:t>Neighborhood — optional.</w:t>
       </w:r>
     </w:p>
     <w:p>
@@ -1877,14 +1982,7 @@
         <w:spacing w:before="240" w:beforeAutospacing="off" w:after="240" w:afterAutospacing="off"/>
       </w:pPr>
       <w:r>
-        <w:rPr>
-          <w:rFonts w:ascii="Arial" w:hAnsi="Arial" w:eastAsia="Arial" w:cs="Arial"/>
-          <w:noProof w:val="0"/>
-          <w:sz w:val="24"/>
-          <w:szCs w:val="24"/>
-          <w:lang w:val="en-US"/>
-        </w:rPr>
-        <w:t>Therefore, the Neighborhood field should contain a predefined default value but should remain editable.</w:t>
+        <w:t>The Neighborhood field may contain a predefined default value, but it must remain editable and optional.</w:t>
       </w:r>
     </w:p>
     <w:p>
@@ -3914,14 +4012,23 @@
         <w:spacing w:before="240" w:beforeAutospacing="off" w:after="240" w:afterAutospacing="off"/>
       </w:pPr>
       <w:r>
-        <w:rPr>
-          <w:rFonts w:ascii="Arial" w:hAnsi="Arial" w:eastAsia="Arial" w:cs="Arial"/>
-          <w:noProof w:val="0"/>
-          <w:sz w:val="24"/>
-          <w:szCs w:val="24"/>
-          <w:lang w:val="en-US"/>
-        </w:rPr>
-        <w:t>By default, orders should be sorted:</w:t>
+        <w:t>By default, the Orders section must show only orders from the current local operating day.</w:t>
+      </w:r>
+    </w:p>
+    <w:p>
+      <w:pPr>
+        <w:spacing w:before="240" w:beforeAutospacing="off" w:after="240" w:afterAutospacing="off"/>
+      </w:pPr>
+      <w:r>
+        <w:t>Historical orders must remain stored in PostgreSQL and must not be permanently hidden or removed. To view orders from other operating days, users must use the date filters.</w:t>
+      </w:r>
+    </w:p>
+    <w:p>
+      <w:pPr>
+        <w:spacing w:before="240" w:beforeAutospacing="off" w:after="240" w:afterAutospacing="off"/>
+      </w:pPr>
+      <w:r>
+        <w:t>Within the selected operating day or date period, orders should be sorted:</w:t>
       </w:r>
     </w:p>
     <w:p>
@@ -3988,14 +4095,7 @@
         </w:rPr>
       </w:pPr>
       <w:r>
-        <w:rPr>
-          <w:rFonts w:ascii="Arial" w:hAnsi="Arial" w:eastAsia="Arial" w:cs="Arial"/>
-          <w:noProof w:val="0"/>
-          <w:sz w:val="24"/>
-          <w:szCs w:val="24"/>
-          <w:lang w:val="en-US"/>
-        </w:rPr>
-        <w:t>Date.</w:t>
+        <w:t>Single Date or Date Range.</w:t>
       </w:r>
     </w:p>
     <w:p>
@@ -4158,6 +4258,22 @@
           <w:lang w:val="en-US"/>
         </w:rPr>
         <w:t>Employee.</w:t>
+      </w:r>
+    </w:p>
+    <w:p>
+      <w:pPr>
+        <w:spacing w:before="240" w:beforeAutospacing="off" w:after="240" w:afterAutospacing="off"/>
+      </w:pPr>
+      <w:r>
+        <w:t>Users may select one specific date or a start and end date to view historical orders. Date-range queries must include both the start date and the end date.</w:t>
+      </w:r>
+    </w:p>
+    <w:p>
+      <w:pPr>
+        <w:spacing w:before="240" w:beforeAutospacing="off" w:after="240" w:afterAutospacing="off"/>
+      </w:pPr>
+      <w:r>
+        <w:t>Results inside the selected period remain sorted newest first.</w:t>
       </w:r>
     </w:p>
     <w:p/>
@@ -9907,6 +10023,46 @@
     </w:p>
     <w:p>
       <w:pPr>
+        <w:pStyle w:val="ListParagraph"/>
+        <w:numPr>
+          <w:ilvl w:val="0"/>
+          <w:numId w:val="78"/>
+        </w:numPr>
+        <w:spacing w:before="240" w:beforeAutospacing="off" w:after="240" w:afterAutospacing="off"/>
+        <w:rPr>
+          <w:rFonts w:ascii="Arial" w:hAnsi="Arial" w:eastAsia="Arial" w:cs="Arial"/>
+          <w:noProof w:val="0"/>
+          <w:sz w:val="24"/>
+          <w:szCs w:val="24"/>
+          <w:lang w:val="en-US"/>
+        </w:rPr>
+      </w:pPr>
+      <w:r>
+        <w:t>Profile.</w:t>
+      </w:r>
+    </w:p>
+    <w:p>
+      <w:pPr>
+        <w:pStyle w:val="ListParagraph"/>
+        <w:numPr>
+          <w:ilvl w:val="0"/>
+          <w:numId w:val="78"/>
+        </w:numPr>
+        <w:spacing w:before="240" w:beforeAutospacing="off" w:after="240" w:afterAutospacing="off"/>
+        <w:rPr>
+          <w:rFonts w:ascii="Arial" w:hAnsi="Arial" w:eastAsia="Arial" w:cs="Arial"/>
+          <w:noProof w:val="0"/>
+          <w:sz w:val="24"/>
+          <w:szCs w:val="24"/>
+          <w:lang w:val="en-US"/>
+        </w:rPr>
+      </w:pPr>
+      <w:r>
+        <w:t>DailyOrderCounter.</w:t>
+      </w:r>
+    </w:p>
+    <w:p>
+      <w:pPr>
         <w:spacing w:before="240" w:beforeAutospacing="off" w:after="240" w:afterAutospacing="off"/>
       </w:pPr>
       <w:r>
@@ -9985,6 +10141,22 @@
         <w:spacing w:before="240" w:beforeAutospacing="off" w:after="240" w:afterAutospacing="off"/>
       </w:pPr>
       <w:r>
+        <w:t>User → has one Profile.</w:t>
+      </w:r>
+    </w:p>
+    <w:p>
+      <w:pPr>
+        <w:spacing w:before="240" w:beforeAutospacing="off" w:after="240" w:afterAutospacing="off"/>
+      </w:pPr>
+      <w:r>
+        <w:t>DailyOrderCounter → maintains the last visible Order Number for each operating date.</w:t>
+      </w:r>
+    </w:p>
+    <w:p>
+      <w:pPr>
+        <w:spacing w:before="240" w:beforeAutospacing="off" w:after="240" w:afterAutospacing="off"/>
+      </w:pPr>
+      <w:r>
         <w:rPr>
           <w:rFonts w:ascii="Arial" w:hAnsi="Arial" w:eastAsia="Arial" w:cs="Arial"/>
           <w:noProof w:val="0"/>
@@ -10143,6 +10315,38 @@
           <w:lang w:val="en-US"/>
         </w:rPr>
         <w:t>Category 1 → N Products.</w:t>
+      </w:r>
+    </w:p>
+    <w:p>
+      <w:pPr>
+        <w:spacing w:before="240" w:beforeAutospacing="off" w:after="240" w:afterAutospacing="off"/>
+      </w:pPr>
+      <w:r>
+        <w:t>Order.id is the permanent internal global identifier and must remain unique across the entire life of the application.</w:t>
+      </w:r>
+    </w:p>
+    <w:p>
+      <w:pPr>
+        <w:spacing w:before="240" w:beforeAutospacing="off" w:after="240" w:afterAutospacing="off"/>
+      </w:pPr>
+      <w:r>
+        <w:t>Order.daily_number is the visible daily Order Number shown to employees and customers.</w:t>
+      </w:r>
+    </w:p>
+    <w:p>
+      <w:pPr>
+        <w:spacing w:before="240" w:beforeAutospacing="off" w:after="240" w:afterAutospacing="off"/>
+      </w:pPr>
+      <w:r>
+        <w:t>Order.operating_date + Order.daily_number must be a unique combination.</w:t>
+      </w:r>
+    </w:p>
+    <w:p>
+      <w:pPr>
+        <w:spacing w:before="240" w:beforeAutospacing="off" w:after="240" w:afterAutospacing="off"/>
+      </w:pPr>
+      <w:r>
+        <w:t>DailyOrderCounter must maintain the last visible Order Number for each operating date and prevent two employees from receiving the same daily number when orders are saved simultaneously.</w:t>
       </w:r>
     </w:p>
     <w:p/>
@@ -10177,6 +10381,22 @@
           <w:lang w:val="en-US"/>
         </w:rPr>
         <w:t>Order history must remain consistent even if menu products change later.</w:t>
+      </w:r>
+    </w:p>
+    <w:p>
+      <w:pPr>
+        <w:spacing w:before="240" w:beforeAutospacing="off" w:after="240" w:afterAutospacing="off"/>
+      </w:pPr>
+      <w:r>
+        <w:t>Orders are historical business records and must not be deleted through the normal administrative panel.</w:t>
+      </w:r>
+    </w:p>
+    <w:p>
+      <w:pPr>
+        <w:spacing w:before="240" w:beforeAutospacing="off" w:after="240" w:afterAutospacing="off"/>
+      </w:pPr>
+      <w:r>
+        <w:t>An order may change status to In Progress, Completed, or Canceled. A Canceled order must remain stored and visible in the order history rather than being deleted.</w:t>
       </w:r>
     </w:p>
     <w:p>

</xml_diff>

<commit_message>
Added configuration to products and categorys
</commit_message>
<xml_diff>
--- a/Described_plan_app_suerte_cafe.docx
+++ b/Described_plan_app_suerte_cafe.docx
@@ -1401,118 +1401,6 @@
         <w:t>The database should still maintain a permanent unique identifier for every order.</w:t>
       </w:r>
     </w:p>
-    <w:p>
-      <w:pPr>
-        <w:spacing w:before="240" w:beforeAutospacing="off" w:after="240" w:afterAutospacing="off"/>
-      </w:pPr>
-      <w:r>
-        <w:t>The application must maintain two separate order identifiers:</w:t>
-      </w:r>
-    </w:p>
-    <w:p>
-      <w:pPr>
-        <w:pStyle w:val="ListParagraph"/>
-        <w:numPr>
-          <w:ilvl w:val="0"/>
-          <w:numId w:val="78"/>
-        </w:numPr>
-        <w:spacing w:before="240" w:beforeAutospacing="off" w:after="240" w:afterAutospacing="off"/>
-        <w:rPr>
-          <w:rFonts w:ascii="Arial" w:hAnsi="Arial" w:eastAsia="Arial" w:cs="Arial"/>
-          <w:noProof w:val="0"/>
-          <w:sz w:val="24"/>
-          <w:szCs w:val="24"/>
-          <w:lang w:val="en-US"/>
-        </w:rPr>
-      </w:pPr>
-      <w:r>
-        <w:t>daily_number: the visible Order Number used by employees and customers. It must be displayed as #001, #002, #003, and so on; increase sequentially during the operating day; reset to #001 at the start of each new operating day; and only needs to be unique together with the operating date.</w:t>
-      </w:r>
-    </w:p>
-    <w:p>
-      <w:pPr>
-        <w:pStyle w:val="ListParagraph"/>
-        <w:numPr>
-          <w:ilvl w:val="0"/>
-          <w:numId w:val="78"/>
-        </w:numPr>
-        <w:spacing w:before="240" w:beforeAutospacing="off" w:after="240" w:afterAutospacing="off"/>
-        <w:rPr>
-          <w:rFonts w:ascii="Arial" w:hAnsi="Arial" w:eastAsia="Arial" w:cs="Arial"/>
-          <w:noProof w:val="0"/>
-          <w:sz w:val="24"/>
-          <w:szCs w:val="24"/>
-          <w:lang w:val="en-US"/>
-        </w:rPr>
-      </w:pPr>
-      <w:r>
-        <w:t>Order.id: the permanent internal global database identifier. It never resets between operating days and continues increasing throughout the life of the application. It must not be confused with the visible daily Order Number.</w:t>
-      </w:r>
-    </w:p>
-    <w:p>
-      <w:pPr>
-        <w:spacing w:before="240" w:beforeAutospacing="off" w:after="240" w:afterAutospacing="off"/>
-      </w:pPr>
-      <w:r>
-        <w:t>The permanent internal database ID acts as the global order identifier. It increases across all operating days and never resets. It remains separate from the visible daily Order Number.</w:t>
-      </w:r>
-    </w:p>
-    <w:p>
-      <w:pPr>
-        <w:spacing w:before="240" w:beforeAutospacing="off" w:after="240" w:afterAutospacing="off"/>
-      </w:pPr>
-      <w:r>
-        <w:t>Conceptual example:</w:t>
-      </w:r>
-    </w:p>
-    <w:p>
-      <w:pPr>
-        <w:spacing w:before="240" w:beforeAutospacing="off" w:after="240" w:afterAutospacing="off"/>
-      </w:pPr>
-      <w:r>
-        <w:t>Day 1:</w:t>
-      </w:r>
-    </w:p>
-    <w:p>
-      <w:pPr>
-        <w:spacing w:before="240" w:beforeAutospacing="off" w:after="240" w:afterAutospacing="off"/>
-      </w:pPr>
-      <w:r>
-        <w:t>Visible numbers: #001 through #010</w:t>
-      </w:r>
-    </w:p>
-    <w:p>
-      <w:pPr>
-        <w:spacing w:before="240" w:beforeAutospacing="off" w:after="240" w:afterAutospacing="off"/>
-      </w:pPr>
-      <w:r>
-        <w:t>Internal global IDs: 1 through 10</w:t>
-      </w:r>
-    </w:p>
-    <w:p>
-      <w:pPr>
-        <w:spacing w:before="240" w:beforeAutospacing="off" w:after="240" w:afterAutospacing="off"/>
-      </w:pPr>
-      <w:r>
-        <w:t>Day 2:</w:t>
-      </w:r>
-    </w:p>
-    <w:p>
-      <w:pPr>
-        <w:spacing w:before="240" w:beforeAutospacing="off" w:after="240" w:afterAutospacing="off"/>
-      </w:pPr>
-      <w:r>
-        <w:t>Visible numbers: #001 through #045</w:t>
-      </w:r>
-    </w:p>
-    <w:p>
-      <w:pPr>
-        <w:spacing w:before="240" w:beforeAutospacing="off" w:after="240" w:afterAutospacing="off"/>
-      </w:pPr>
-      <w:r>
-        <w:t>Internal global IDs: 11 through 55</w:t>
-      </w:r>
-    </w:p>
     <w:p/>
     <w:p>
       <w:pPr>
@@ -1932,7 +1820,14 @@
         </w:rPr>
       </w:pPr>
       <w:r>
-        <w:t>Neighborhood — optional.</w:t>
+        <w:rPr>
+          <w:rFonts w:ascii="Arial" w:hAnsi="Arial" w:eastAsia="Arial" w:cs="Arial"/>
+          <w:noProof w:val="0"/>
+          <w:sz w:val="24"/>
+          <w:szCs w:val="24"/>
+          <w:lang w:val="en-US"/>
+        </w:rPr>
+        <w:t>Neighborhood.</w:t>
       </w:r>
     </w:p>
     <w:p>
@@ -1982,7 +1877,14 @@
         <w:spacing w:before="240" w:beforeAutospacing="off" w:after="240" w:afterAutospacing="off"/>
       </w:pPr>
       <w:r>
-        <w:t>The Neighborhood field may contain a predefined default value, but it must remain editable and optional.</w:t>
+        <w:rPr>
+          <w:rFonts w:ascii="Arial" w:hAnsi="Arial" w:eastAsia="Arial" w:cs="Arial"/>
+          <w:noProof w:val="0"/>
+          <w:sz w:val="24"/>
+          <w:szCs w:val="24"/>
+          <w:lang w:val="en-US"/>
+        </w:rPr>
+        <w:t>Therefore, the Neighborhood field should contain a predefined default value but should remain editable.</w:t>
       </w:r>
     </w:p>
     <w:p>
@@ -4012,23 +3914,14 @@
         <w:spacing w:before="240" w:beforeAutospacing="off" w:after="240" w:afterAutospacing="off"/>
       </w:pPr>
       <w:r>
-        <w:t>By default, the Orders section must show only orders from the current local operating day.</w:t>
-      </w:r>
-    </w:p>
-    <w:p>
-      <w:pPr>
-        <w:spacing w:before="240" w:beforeAutospacing="off" w:after="240" w:afterAutospacing="off"/>
-      </w:pPr>
-      <w:r>
-        <w:t>Historical orders must remain stored in PostgreSQL and must not be permanently hidden or removed. To view orders from other operating days, users must use the date filters.</w:t>
-      </w:r>
-    </w:p>
-    <w:p>
-      <w:pPr>
-        <w:spacing w:before="240" w:beforeAutospacing="off" w:after="240" w:afterAutospacing="off"/>
-      </w:pPr>
-      <w:r>
-        <w:t>Within the selected operating day or date period, orders should be sorted:</w:t>
+        <w:rPr>
+          <w:rFonts w:ascii="Arial" w:hAnsi="Arial" w:eastAsia="Arial" w:cs="Arial"/>
+          <w:noProof w:val="0"/>
+          <w:sz w:val="24"/>
+          <w:szCs w:val="24"/>
+          <w:lang w:val="en-US"/>
+        </w:rPr>
+        <w:t>By default, orders should be sorted:</w:t>
       </w:r>
     </w:p>
     <w:p>
@@ -4095,7 +3988,14 @@
         </w:rPr>
       </w:pPr>
       <w:r>
-        <w:t>Single Date or Date Range.</w:t>
+        <w:rPr>
+          <w:rFonts w:ascii="Arial" w:hAnsi="Arial" w:eastAsia="Arial" w:cs="Arial"/>
+          <w:noProof w:val="0"/>
+          <w:sz w:val="24"/>
+          <w:szCs w:val="24"/>
+          <w:lang w:val="en-US"/>
+        </w:rPr>
+        <w:t>Date.</w:t>
       </w:r>
     </w:p>
     <w:p>
@@ -4260,22 +4160,6 @@
         <w:t>Employee.</w:t>
       </w:r>
     </w:p>
-    <w:p>
-      <w:pPr>
-        <w:spacing w:before="240" w:beforeAutospacing="off" w:after="240" w:afterAutospacing="off"/>
-      </w:pPr>
-      <w:r>
-        <w:t>Users may select one specific date or a start and end date to view historical orders. Date-range queries must include both the start date and the end date.</w:t>
-      </w:r>
-    </w:p>
-    <w:p>
-      <w:pPr>
-        <w:spacing w:before="240" w:beforeAutospacing="off" w:after="240" w:afterAutospacing="off"/>
-      </w:pPr>
-      <w:r>
-        <w:t>Results inside the selected period remain sorted newest first.</w:t>
-      </w:r>
-    </w:p>
     <w:p/>
     <w:p>
       <w:pPr>
@@ -5578,6 +5462,21 @@
           <w:szCs w:val="24"/>
           <w:lang w:val="en-US"/>
         </w:rPr>
+        <w:t>The Menu Configuration section is restricted to authenticated Administrators. Regular Users may view the available menu while creating orders, but they may not access menu-management operations.</w:t>
+      </w:r>
+    </w:p>
+    <w:p>
+      <w:pPr>
+        <w:spacing w:before="240" w:beforeAutospacing="off" w:after="240" w:afterAutospacing="off"/>
+      </w:pPr>
+      <w:r>
+        <w:rPr>
+          <w:rFonts w:ascii="Arial" w:hAnsi="Arial" w:eastAsia="Arial" w:cs="Arial"/>
+          <w:noProof w:val="0"/>
+          <w:sz w:val="24"/>
+          <w:szCs w:val="24"/>
+          <w:lang w:val="en-US"/>
+        </w:rPr>
         <w:t>This section contains two principal modules:</w:t>
       </w:r>
     </w:p>
@@ -5635,7 +5534,11 @@
         <w:t>Products.</w:t>
       </w:r>
     </w:p>
-    <w:p/>
+    <w:p>
+      <w:r>
+        <w:t/>
+      </w:r>
+    </w:p>
     <w:p>
       <w:pPr>
         <w:pStyle w:val="Heading1"/>
@@ -5674,7 +5577,7 @@
         <w:pStyle w:val="ListParagraph"/>
         <w:numPr>
           <w:ilvl w:val="0"/>
-          <w:numId w:val="97"/>
+          <w:numId w:val="96"/>
         </w:numPr>
         <w:spacing w:before="240" w:beforeAutospacing="off" w:after="240" w:afterAutospacing="off"/>
         <w:rPr>
@@ -5701,7 +5604,7 @@
         <w:pStyle w:val="ListParagraph"/>
         <w:numPr>
           <w:ilvl w:val="0"/>
-          <w:numId w:val="97"/>
+          <w:numId w:val="96"/>
         </w:numPr>
         <w:spacing w:before="240" w:beforeAutospacing="off" w:after="240" w:afterAutospacing="off"/>
         <w:rPr>
@@ -5735,7 +5638,105 @@
           <w:szCs w:val="24"/>
           <w:lang w:val="en-US"/>
         </w:rPr>
-        <w:t>Users can:</w:t>
+        <w:t>Administrators can create, edit, and delete categories.</w:t>
+      </w:r>
+    </w:p>
+    <w:p>
+      <w:pPr>
+        <w:spacing w:before="240" w:beforeAutospacing="off" w:after="240" w:afterAutospacing="off"/>
+      </w:pPr>
+      <w:r>
+        <w:rPr>
+          <w:rFonts w:ascii="Arial" w:hAnsi="Arial" w:eastAsia="Arial" w:cs="Arial"/>
+          <w:noProof w:val="0"/>
+          <w:sz w:val="24"/>
+          <w:szCs w:val="24"/>
+          <w:lang w:val="en-US"/>
+        </w:rPr>
+        <w:t>If a category contains products, the system should prevent accidental deletion and show an appropriate warning.</w:t>
+      </w:r>
+    </w:p>
+    <w:p>
+      <w:pPr>
+        <w:spacing w:before="240" w:beforeAutospacing="off" w:after="240" w:afterAutospacing="off"/>
+      </w:pPr>
+      <w:r>
+        <w:rPr>
+          <w:rFonts w:ascii="Arial" w:hAnsi="Arial" w:eastAsia="Arial" w:cs="Arial"/>
+          <w:noProof w:val="0"/>
+          <w:sz w:val="24"/>
+          <w:szCs w:val="24"/>
+          <w:lang w:val="en-US"/>
+        </w:rPr>
+        <w:t>All destructive category actions must require confirmation.</w:t>
+      </w:r>
+    </w:p>
+    <w:p>
+      <w:r>
+        <w:t/>
+      </w:r>
+    </w:p>
+    <w:p>
+      <w:pPr>
+        <w:pStyle w:val="Heading1"/>
+        <w:spacing w:before="322" w:beforeAutospacing="off" w:after="322" w:afterAutospacing="off"/>
+      </w:pPr>
+      <w:r>
+        <w:rPr>
+          <w:rFonts w:ascii="Arial" w:hAnsi="Arial" w:eastAsia="Arial" w:cs="Arial"/>
+          <w:b w:val="1"/>
+          <w:bCs w:val="1"/>
+          <w:noProof w:val="0"/>
+          <w:sz w:val="48"/>
+          <w:szCs w:val="48"/>
+          <w:lang w:val="en-US"/>
+        </w:rPr>
+        <w:t>20. PRODUCT MANAGEMENT</w:t>
+      </w:r>
+    </w:p>
+    <w:p>
+      <w:pPr>
+        <w:spacing w:before="240" w:beforeAutospacing="off" w:after="240" w:afterAutospacing="off"/>
+      </w:pPr>
+      <w:r>
+        <w:rPr>
+          <w:rFonts w:ascii="Arial" w:hAnsi="Arial" w:eastAsia="Arial" w:cs="Arial"/>
+          <w:noProof w:val="0"/>
+          <w:sz w:val="24"/>
+          <w:szCs w:val="24"/>
+          <w:lang w:val="en-US"/>
+        </w:rPr>
+        <w:t>Each product must belong to a category.</w:t>
+      </w:r>
+    </w:p>
+    <w:p>
+      <w:pPr>
+        <w:spacing w:before="240" w:beforeAutospacing="off" w:after="240" w:afterAutospacing="off"/>
+      </w:pPr>
+      <w:r>
+        <w:rPr>
+          <w:rFonts w:ascii="Arial" w:hAnsi="Arial" w:eastAsia="Arial" w:cs="Arial"/>
+          <w:noProof w:val="0"/>
+          <w:sz w:val="24"/>
+          <w:szCs w:val="24"/>
+          <w:lang w:val="en-US"/>
+        </w:rPr>
+        <w:t>A product cannot exist without an associated category.</w:t>
+      </w:r>
+    </w:p>
+    <w:p>
+      <w:pPr>
+        <w:spacing w:before="240" w:beforeAutospacing="off" w:after="240" w:afterAutospacing="off"/>
+      </w:pPr>
+      <w:r>
+        <w:rPr>
+          <w:rFonts w:ascii="Arial" w:hAnsi="Arial" w:eastAsia="Arial" w:cs="Arial"/>
+          <w:noProof w:val="0"/>
+          <w:sz w:val="24"/>
+          <w:szCs w:val="24"/>
+          <w:lang w:val="en-US"/>
+        </w:rPr>
+        <w:t>Product fields:</w:t>
       </w:r>
     </w:p>
     <w:p>
@@ -5743,7 +5744,7 @@
         <w:pStyle w:val="ListParagraph"/>
         <w:numPr>
           <w:ilvl w:val="0"/>
-          <w:numId w:val="98"/>
+          <w:numId w:val="96"/>
         </w:numPr>
         <w:spacing w:before="240" w:beforeAutospacing="off" w:after="240" w:afterAutospacing="off"/>
         <w:rPr>
@@ -5762,7 +5763,7 @@
           <w:szCs w:val="24"/>
           <w:lang w:val="en-US"/>
         </w:rPr>
-        <w:t>Create categories.</w:t>
+        <w:t>Product Name — required.</w:t>
       </w:r>
     </w:p>
     <w:p>
@@ -5770,7 +5771,7 @@
         <w:pStyle w:val="ListParagraph"/>
         <w:numPr>
           <w:ilvl w:val="0"/>
-          <w:numId w:val="98"/>
+          <w:numId w:val="96"/>
         </w:numPr>
         <w:spacing w:before="240" w:beforeAutospacing="off" w:after="240" w:afterAutospacing="off"/>
         <w:rPr>
@@ -5789,22 +5790,7 @@
           <w:szCs w:val="24"/>
           <w:lang w:val="en-US"/>
         </w:rPr>
-        <w:t>Edit categories.</w:t>
-      </w:r>
-    </w:p>
-    <w:p>
-      <w:pPr>
-        <w:spacing w:before="240" w:beforeAutospacing="off" w:after="240" w:afterAutospacing="off"/>
-      </w:pPr>
-      <w:r>
-        <w:rPr>
-          <w:rFonts w:ascii="Arial" w:hAnsi="Arial" w:eastAsia="Arial" w:cs="Arial"/>
-          <w:noProof w:val="0"/>
-          <w:sz w:val="24"/>
-          <w:szCs w:val="24"/>
-          <w:lang w:val="en-US"/>
-        </w:rPr>
-        <w:t>Administrators can additionally:</w:t>
+        <w:t>Category — required.</w:t>
       </w:r>
     </w:p>
     <w:p>
@@ -5812,7 +5798,7 @@
         <w:pStyle w:val="ListParagraph"/>
         <w:numPr>
           <w:ilvl w:val="0"/>
-          <w:numId w:val="99"/>
+          <w:numId w:val="96"/>
         </w:numPr>
         <w:spacing w:before="240" w:beforeAutospacing="off" w:after="240" w:afterAutospacing="off"/>
         <w:rPr>
@@ -5831,86 +5817,7 @@
           <w:szCs w:val="24"/>
           <w:lang w:val="en-US"/>
         </w:rPr>
-        <w:t>Delete categories.</w:t>
-      </w:r>
-    </w:p>
-    <w:p>
-      <w:pPr>
-        <w:spacing w:before="240" w:beforeAutospacing="off" w:after="240" w:afterAutospacing="off"/>
-      </w:pPr>
-      <w:r>
-        <w:rPr>
-          <w:rFonts w:ascii="Arial" w:hAnsi="Arial" w:eastAsia="Arial" w:cs="Arial"/>
-          <w:noProof w:val="0"/>
-          <w:sz w:val="24"/>
-          <w:szCs w:val="24"/>
-          <w:lang w:val="en-US"/>
-        </w:rPr>
-        <w:t>If a category contains products, the system should prevent accidental deletion and show an appropriate warning.</w:t>
-      </w:r>
-    </w:p>
-    <w:p/>
-    <w:p>
-      <w:pPr>
-        <w:pStyle w:val="Heading1"/>
-        <w:spacing w:before="322" w:beforeAutospacing="off" w:after="322" w:afterAutospacing="off"/>
-      </w:pPr>
-      <w:r>
-        <w:rPr>
-          <w:rFonts w:ascii="Arial" w:hAnsi="Arial" w:eastAsia="Arial" w:cs="Arial"/>
-          <w:b w:val="1"/>
-          <w:bCs w:val="1"/>
-          <w:noProof w:val="0"/>
-          <w:sz w:val="48"/>
-          <w:szCs w:val="48"/>
-          <w:lang w:val="en-US"/>
-        </w:rPr>
-        <w:t>20. PRODUCT MANAGEMENT</w:t>
-      </w:r>
-    </w:p>
-    <w:p>
-      <w:pPr>
-        <w:spacing w:before="240" w:beforeAutospacing="off" w:after="240" w:afterAutospacing="off"/>
-      </w:pPr>
-      <w:r>
-        <w:rPr>
-          <w:rFonts w:ascii="Arial" w:hAnsi="Arial" w:eastAsia="Arial" w:cs="Arial"/>
-          <w:noProof w:val="0"/>
-          <w:sz w:val="24"/>
-          <w:szCs w:val="24"/>
-          <w:lang w:val="en-US"/>
-        </w:rPr>
-        <w:t>Each product must belong to a category.</w:t>
-      </w:r>
-    </w:p>
-    <w:p>
-      <w:pPr>
-        <w:spacing w:before="240" w:beforeAutospacing="off" w:after="240" w:afterAutospacing="off"/>
-      </w:pPr>
-      <w:r>
-        <w:rPr>
-          <w:rFonts w:ascii="Arial" w:hAnsi="Arial" w:eastAsia="Arial" w:cs="Arial"/>
-          <w:noProof w:val="0"/>
-          <w:sz w:val="24"/>
-          <w:szCs w:val="24"/>
-          <w:lang w:val="en-US"/>
-        </w:rPr>
-        <w:t>A product cannot exist without an associated category.</w:t>
-      </w:r>
-    </w:p>
-    <w:p>
-      <w:pPr>
-        <w:spacing w:before="240" w:beforeAutospacing="off" w:after="240" w:afterAutospacing="off"/>
-      </w:pPr>
-      <w:r>
-        <w:rPr>
-          <w:rFonts w:ascii="Arial" w:hAnsi="Arial" w:eastAsia="Arial" w:cs="Arial"/>
-          <w:noProof w:val="0"/>
-          <w:sz w:val="24"/>
-          <w:szCs w:val="24"/>
-          <w:lang w:val="en-US"/>
-        </w:rPr>
-        <w:t>Product fields:</w:t>
+        <w:t>Price — required.</w:t>
       </w:r>
     </w:p>
     <w:p>
@@ -5918,7 +5825,7 @@
         <w:pStyle w:val="ListParagraph"/>
         <w:numPr>
           <w:ilvl w:val="0"/>
-          <w:numId w:val="100"/>
+          <w:numId w:val="96"/>
         </w:numPr>
         <w:spacing w:before="240" w:beforeAutospacing="off" w:after="240" w:afterAutospacing="off"/>
         <w:rPr>
@@ -5937,7 +5844,7 @@
           <w:szCs w:val="24"/>
           <w:lang w:val="en-US"/>
         </w:rPr>
-        <w:t>Product Name — required.</w:t>
+        <w:t>Product Image — optional.</w:t>
       </w:r>
     </w:p>
     <w:p>
@@ -5945,7 +5852,7 @@
         <w:pStyle w:val="ListParagraph"/>
         <w:numPr>
           <w:ilvl w:val="0"/>
-          <w:numId w:val="100"/>
+          <w:numId w:val="96"/>
         </w:numPr>
         <w:spacing w:before="240" w:beforeAutospacing="off" w:after="240" w:afterAutospacing="off"/>
         <w:rPr>
@@ -5964,7 +5871,7 @@
           <w:szCs w:val="24"/>
           <w:lang w:val="en-US"/>
         </w:rPr>
-        <w:t>Category — required.</w:t>
+        <w:t>Description — optional.</w:t>
       </w:r>
     </w:p>
     <w:p>
@@ -5972,7 +5879,7 @@
         <w:pStyle w:val="ListParagraph"/>
         <w:numPr>
           <w:ilvl w:val="0"/>
-          <w:numId w:val="100"/>
+          <w:numId w:val="96"/>
         </w:numPr>
         <w:spacing w:before="240" w:beforeAutospacing="off" w:after="240" w:afterAutospacing="off"/>
         <w:rPr>
@@ -5991,87 +5898,6 @@
           <w:szCs w:val="24"/>
           <w:lang w:val="en-US"/>
         </w:rPr>
-        <w:t>Price — required.</w:t>
-      </w:r>
-    </w:p>
-    <w:p>
-      <w:pPr>
-        <w:pStyle w:val="ListParagraph"/>
-        <w:numPr>
-          <w:ilvl w:val="0"/>
-          <w:numId w:val="100"/>
-        </w:numPr>
-        <w:spacing w:before="240" w:beforeAutospacing="off" w:after="240" w:afterAutospacing="off"/>
-        <w:rPr>
-          <w:rFonts w:ascii="Arial" w:hAnsi="Arial" w:eastAsia="Arial" w:cs="Arial"/>
-          <w:noProof w:val="0"/>
-          <w:sz w:val="24"/>
-          <w:szCs w:val="24"/>
-          <w:lang w:val="en-US"/>
-        </w:rPr>
-      </w:pPr>
-      <w:r>
-        <w:rPr>
-          <w:rFonts w:ascii="Arial" w:hAnsi="Arial" w:eastAsia="Arial" w:cs="Arial"/>
-          <w:noProof w:val="0"/>
-          <w:sz w:val="24"/>
-          <w:szCs w:val="24"/>
-          <w:lang w:val="en-US"/>
-        </w:rPr>
-        <w:t>Product Image — optional.</w:t>
-      </w:r>
-    </w:p>
-    <w:p>
-      <w:pPr>
-        <w:pStyle w:val="ListParagraph"/>
-        <w:numPr>
-          <w:ilvl w:val="0"/>
-          <w:numId w:val="100"/>
-        </w:numPr>
-        <w:spacing w:before="240" w:beforeAutospacing="off" w:after="240" w:afterAutospacing="off"/>
-        <w:rPr>
-          <w:rFonts w:ascii="Arial" w:hAnsi="Arial" w:eastAsia="Arial" w:cs="Arial"/>
-          <w:noProof w:val="0"/>
-          <w:sz w:val="24"/>
-          <w:szCs w:val="24"/>
-          <w:lang w:val="en-US"/>
-        </w:rPr>
-      </w:pPr>
-      <w:r>
-        <w:rPr>
-          <w:rFonts w:ascii="Arial" w:hAnsi="Arial" w:eastAsia="Arial" w:cs="Arial"/>
-          <w:noProof w:val="0"/>
-          <w:sz w:val="24"/>
-          <w:szCs w:val="24"/>
-          <w:lang w:val="en-US"/>
-        </w:rPr>
-        <w:t>Description — optional.</w:t>
-      </w:r>
-    </w:p>
-    <w:p>
-      <w:pPr>
-        <w:pStyle w:val="ListParagraph"/>
-        <w:numPr>
-          <w:ilvl w:val="0"/>
-          <w:numId w:val="100"/>
-        </w:numPr>
-        <w:spacing w:before="240" w:beforeAutospacing="off" w:after="240" w:afterAutospacing="off"/>
-        <w:rPr>
-          <w:rFonts w:ascii="Arial" w:hAnsi="Arial" w:eastAsia="Arial" w:cs="Arial"/>
-          <w:noProof w:val="0"/>
-          <w:sz w:val="24"/>
-          <w:szCs w:val="24"/>
-          <w:lang w:val="en-US"/>
-        </w:rPr>
-      </w:pPr>
-      <w:r>
-        <w:rPr>
-          <w:rFonts w:ascii="Arial" w:hAnsi="Arial" w:eastAsia="Arial" w:cs="Arial"/>
-          <w:noProof w:val="0"/>
-          <w:sz w:val="24"/>
-          <w:szCs w:val="24"/>
-          <w:lang w:val="en-US"/>
-        </w:rPr>
         <w:t>Availability — Available / Unavailable.</w:t>
       </w:r>
     </w:p>
@@ -6087,130 +5913,7 @@
           <w:szCs w:val="24"/>
           <w:lang w:val="en-US"/>
         </w:rPr>
-        <w:t>Regular users can:</w:t>
-      </w:r>
-    </w:p>
-    <w:p>
-      <w:pPr>
-        <w:pStyle w:val="ListParagraph"/>
-        <w:numPr>
-          <w:ilvl w:val="0"/>
-          <w:numId w:val="101"/>
-        </w:numPr>
-        <w:spacing w:before="240" w:beforeAutospacing="off" w:after="240" w:afterAutospacing="off"/>
-        <w:rPr>
-          <w:rFonts w:ascii="Arial" w:hAnsi="Arial" w:eastAsia="Arial" w:cs="Arial"/>
-          <w:noProof w:val="0"/>
-          <w:sz w:val="24"/>
-          <w:szCs w:val="24"/>
-          <w:lang w:val="en-US"/>
-        </w:rPr>
-      </w:pPr>
-      <w:r>
-        <w:rPr>
-          <w:rFonts w:ascii="Arial" w:hAnsi="Arial" w:eastAsia="Arial" w:cs="Arial"/>
-          <w:noProof w:val="0"/>
-          <w:sz w:val="24"/>
-          <w:szCs w:val="24"/>
-          <w:lang w:val="en-US"/>
-        </w:rPr>
-        <w:t>Create products.</w:t>
-      </w:r>
-    </w:p>
-    <w:p>
-      <w:pPr>
-        <w:pStyle w:val="ListParagraph"/>
-        <w:numPr>
-          <w:ilvl w:val="0"/>
-          <w:numId w:val="101"/>
-        </w:numPr>
-        <w:spacing w:before="240" w:beforeAutospacing="off" w:after="240" w:afterAutospacing="off"/>
-        <w:rPr>
-          <w:rFonts w:ascii="Arial" w:hAnsi="Arial" w:eastAsia="Arial" w:cs="Arial"/>
-          <w:noProof w:val="0"/>
-          <w:sz w:val="24"/>
-          <w:szCs w:val="24"/>
-          <w:lang w:val="en-US"/>
-        </w:rPr>
-      </w:pPr>
-      <w:r>
-        <w:rPr>
-          <w:rFonts w:ascii="Arial" w:hAnsi="Arial" w:eastAsia="Arial" w:cs="Arial"/>
-          <w:noProof w:val="0"/>
-          <w:sz w:val="24"/>
-          <w:szCs w:val="24"/>
-          <w:lang w:val="en-US"/>
-        </w:rPr>
-        <w:t>Edit products.</w:t>
-      </w:r>
-    </w:p>
-    <w:p>
-      <w:pPr>
-        <w:pStyle w:val="ListParagraph"/>
-        <w:numPr>
-          <w:ilvl w:val="0"/>
-          <w:numId w:val="101"/>
-        </w:numPr>
-        <w:spacing w:before="240" w:beforeAutospacing="off" w:after="240" w:afterAutospacing="off"/>
-        <w:rPr>
-          <w:rFonts w:ascii="Arial" w:hAnsi="Arial" w:eastAsia="Arial" w:cs="Arial"/>
-          <w:noProof w:val="0"/>
-          <w:sz w:val="24"/>
-          <w:szCs w:val="24"/>
-          <w:lang w:val="en-US"/>
-        </w:rPr>
-      </w:pPr>
-      <w:r>
-        <w:rPr>
-          <w:rFonts w:ascii="Arial" w:hAnsi="Arial" w:eastAsia="Arial" w:cs="Arial"/>
-          <w:noProof w:val="0"/>
-          <w:sz w:val="24"/>
-          <w:szCs w:val="24"/>
-          <w:lang w:val="en-US"/>
-        </w:rPr>
-        <w:t>Change availability.</w:t>
-      </w:r>
-    </w:p>
-    <w:p>
-      <w:pPr>
-        <w:spacing w:before="240" w:beforeAutospacing="off" w:after="240" w:afterAutospacing="off"/>
-      </w:pPr>
-      <w:r>
-        <w:rPr>
-          <w:rFonts w:ascii="Arial" w:hAnsi="Arial" w:eastAsia="Arial" w:cs="Arial"/>
-          <w:noProof w:val="0"/>
-          <w:sz w:val="24"/>
-          <w:szCs w:val="24"/>
-          <w:lang w:val="en-US"/>
-        </w:rPr>
-        <w:t>Administrators can additionally:</w:t>
-      </w:r>
-    </w:p>
-    <w:p>
-      <w:pPr>
-        <w:pStyle w:val="ListParagraph"/>
-        <w:numPr>
-          <w:ilvl w:val="0"/>
-          <w:numId w:val="102"/>
-        </w:numPr>
-        <w:spacing w:before="240" w:beforeAutospacing="off" w:after="240" w:afterAutospacing="off"/>
-        <w:rPr>
-          <w:rFonts w:ascii="Arial" w:hAnsi="Arial" w:eastAsia="Arial" w:cs="Arial"/>
-          <w:noProof w:val="0"/>
-          <w:sz w:val="24"/>
-          <w:szCs w:val="24"/>
-          <w:lang w:val="en-US"/>
-        </w:rPr>
-      </w:pPr>
-      <w:r>
-        <w:rPr>
-          <w:rFonts w:ascii="Arial" w:hAnsi="Arial" w:eastAsia="Arial" w:cs="Arial"/>
-          <w:noProof w:val="0"/>
-          <w:sz w:val="24"/>
-          <w:szCs w:val="24"/>
-          <w:lang w:val="en-US"/>
-        </w:rPr>
-        <w:t>Delete products.</w:t>
+        <w:t>Administrators can create, edit, delete, and change the availability of products.</w:t>
       </w:r>
     </w:p>
     <w:p>
@@ -6228,7 +5931,26 @@
         <w:t>When an available product is created, it should automatically appear in the New Order menu.</w:t>
       </w:r>
     </w:p>
-    <w:p/>
+    <w:p>
+      <w:pPr>
+        <w:spacing w:before="240" w:beforeAutospacing="off" w:after="240" w:afterAutospacing="off"/>
+      </w:pPr>
+      <w:r>
+        <w:rPr>
+          <w:rFonts w:ascii="Arial" w:hAnsi="Arial" w:eastAsia="Arial" w:cs="Arial"/>
+          <w:noProof w:val="0"/>
+          <w:sz w:val="24"/>
+          <w:szCs w:val="24"/>
+          <w:lang w:val="en-US"/>
+        </w:rPr>
+        <w:t>Unavailable products remain stored in the system and remain visible in historical orders and reports.</w:t>
+      </w:r>
+    </w:p>
+    <w:p>
+      <w:r>
+        <w:t/>
+      </w:r>
+    </w:p>
     <w:p>
       <w:pPr>
         <w:pStyle w:val="Heading1"/>
@@ -8025,7 +7747,7 @@
           <w:szCs w:val="24"/>
           <w:lang w:val="en-US"/>
         </w:rPr>
-        <w:t>Create orders.</w:t>
+        <w:t>View the available menu.</w:t>
       </w:r>
     </w:p>
     <w:p>
@@ -8052,7 +7774,7 @@
           <w:szCs w:val="24"/>
           <w:lang w:val="en-US"/>
         </w:rPr>
-        <w:t>View orders.</w:t>
+        <w:t>View categories and products needed to create orders.</w:t>
       </w:r>
     </w:p>
     <w:p>
@@ -8079,7 +7801,7 @@
           <w:szCs w:val="24"/>
           <w:lang w:val="en-US"/>
         </w:rPr>
-        <w:t>Edit orders.</w:t>
+        <w:t>Create orders.</w:t>
       </w:r>
     </w:p>
     <w:p>
@@ -8106,7 +7828,7 @@
           <w:szCs w:val="24"/>
           <w:lang w:val="en-US"/>
         </w:rPr>
-        <w:t>Change order statuses.</w:t>
+        <w:t>View orders.</w:t>
       </w:r>
     </w:p>
     <w:p>
@@ -8133,7 +7855,7 @@
           <w:szCs w:val="24"/>
           <w:lang w:val="en-US"/>
         </w:rPr>
-        <w:t>Create categories.</w:t>
+        <w:t>Edit orders.</w:t>
       </w:r>
     </w:p>
     <w:p>
@@ -8160,7 +7882,7 @@
           <w:szCs w:val="24"/>
           <w:lang w:val="en-US"/>
         </w:rPr>
-        <w:t>Edit categories.</w:t>
+        <w:t>Change order statuses.</w:t>
       </w:r>
     </w:p>
     <w:p>
@@ -8187,7 +7909,7 @@
           <w:szCs w:val="24"/>
           <w:lang w:val="en-US"/>
         </w:rPr>
-        <w:t>Create products.</w:t>
+        <w:t>View reports.</w:t>
       </w:r>
     </w:p>
     <w:p>
@@ -8214,7 +7936,7 @@
           <w:szCs w:val="24"/>
           <w:lang w:val="en-US"/>
         </w:rPr>
-        <w:t>Edit products.</w:t>
+        <w:t>Use the calculator.</w:t>
       </w:r>
     </w:p>
     <w:p>
@@ -8241,7 +7963,22 @@
           <w:szCs w:val="24"/>
           <w:lang w:val="en-US"/>
         </w:rPr>
-        <w:t>Change product availability.</w:t>
+        <w:t>Edit their own profile.</w:t>
+      </w:r>
+    </w:p>
+    <w:p>
+      <w:pPr>
+        <w:spacing w:before="240" w:beforeAutospacing="off" w:after="240" w:afterAutospacing="off"/>
+      </w:pPr>
+      <w:r>
+        <w:rPr>
+          <w:rFonts w:ascii="Arial" w:hAnsi="Arial" w:eastAsia="Arial" w:cs="Arial"/>
+          <w:noProof w:val="0"/>
+          <w:sz w:val="24"/>
+          <w:szCs w:val="24"/>
+          <w:lang w:val="en-US"/>
+        </w:rPr>
+        <w:t>Cannot:</w:t>
       </w:r>
     </w:p>
     <w:p>
@@ -8268,7 +8005,7 @@
           <w:szCs w:val="24"/>
           <w:lang w:val="en-US"/>
         </w:rPr>
-        <w:t>View reports.</w:t>
+        <w:t>Access Menu Configuration.</w:t>
       </w:r>
     </w:p>
     <w:p>
@@ -8295,7 +8032,7 @@
           <w:szCs w:val="24"/>
           <w:lang w:val="en-US"/>
         </w:rPr>
-        <w:t>Use the calculator.</w:t>
+        <w:t>Create, edit, or delete categories.</w:t>
       </w:r>
     </w:p>
     <w:p>
@@ -8322,22 +8059,7 @@
           <w:szCs w:val="24"/>
           <w:lang w:val="en-US"/>
         </w:rPr>
-        <w:t>Edit their own profile.</w:t>
-      </w:r>
-    </w:p>
-    <w:p>
-      <w:pPr>
-        <w:spacing w:before="240" w:beforeAutospacing="off" w:after="240" w:afterAutospacing="off"/>
-      </w:pPr>
-      <w:r>
-        <w:rPr>
-          <w:rFonts w:ascii="Arial" w:hAnsi="Arial" w:eastAsia="Arial" w:cs="Arial"/>
-          <w:noProof w:val="0"/>
-          <w:sz w:val="24"/>
-          <w:szCs w:val="24"/>
-          <w:lang w:val="en-US"/>
-        </w:rPr>
-        <w:t>Cannot:</w:t>
+        <w:t>Create, edit, or delete products.</w:t>
       </w:r>
     </w:p>
     <w:p>
@@ -8345,7 +8067,7 @@
         <w:pStyle w:val="ListParagraph"/>
         <w:numPr>
           <w:ilvl w:val="0"/>
-          <w:numId w:val="112"/>
+          <w:numId w:val="111"/>
         </w:numPr>
         <w:spacing w:before="240" w:beforeAutospacing="off" w:after="240" w:afterAutospacing="off"/>
         <w:rPr>
@@ -8364,7 +8086,7 @@
           <w:szCs w:val="24"/>
           <w:lang w:val="en-US"/>
         </w:rPr>
-        <w:t>Delete products.</w:t>
+        <w:t>Change product availability.</w:t>
       </w:r>
     </w:p>
     <w:p>
@@ -8372,7 +8094,7 @@
         <w:pStyle w:val="ListParagraph"/>
         <w:numPr>
           <w:ilvl w:val="0"/>
-          <w:numId w:val="112"/>
+          <w:numId w:val="111"/>
         </w:numPr>
         <w:spacing w:before="240" w:beforeAutospacing="off" w:after="240" w:afterAutospacing="off"/>
         <w:rPr>
@@ -8391,7 +8113,55 @@
           <w:szCs w:val="24"/>
           <w:lang w:val="en-US"/>
         </w:rPr>
-        <w:t>Delete categories.</w:t>
+        <w:t>Delete users.</w:t>
+      </w:r>
+    </w:p>
+    <w:p>
+      <w:pPr>
+        <w:pStyle w:val="Heading2"/>
+        <w:spacing w:before="299" w:beforeAutospacing="off" w:after="299" w:afterAutospacing="off"/>
+      </w:pPr>
+      <w:r>
+        <w:rPr>
+          <w:rFonts w:ascii="Arial" w:hAnsi="Arial" w:eastAsia="Arial" w:cs="Arial"/>
+          <w:b w:val="1"/>
+          <w:bCs w:val="1"/>
+          <w:noProof w:val="0"/>
+          <w:sz w:val="36"/>
+          <w:szCs w:val="36"/>
+          <w:lang w:val="en-US"/>
+        </w:rPr>
+        <w:t>Administrator</w:t>
+      </w:r>
+    </w:p>
+    <w:p>
+      <w:pPr>
+        <w:spacing w:before="240" w:beforeAutospacing="off" w:after="240" w:afterAutospacing="off"/>
+      </w:pPr>
+      <w:r>
+        <w:rPr>
+          <w:rFonts w:ascii="Arial" w:hAnsi="Arial" w:eastAsia="Arial" w:cs="Arial"/>
+          <w:noProof w:val="0"/>
+          <w:sz w:val="24"/>
+          <w:szCs w:val="24"/>
+          <w:lang w:val="en-US"/>
+        </w:rPr>
+        <w:t>Can perform everything a Regular User can.</w:t>
+      </w:r>
+    </w:p>
+    <w:p>
+      <w:pPr>
+        <w:spacing w:before="240" w:beforeAutospacing="off" w:after="240" w:afterAutospacing="off"/>
+      </w:pPr>
+      <w:r>
+        <w:rPr>
+          <w:rFonts w:ascii="Arial" w:hAnsi="Arial" w:eastAsia="Arial" w:cs="Arial"/>
+          <w:noProof w:val="0"/>
+          <w:sz w:val="24"/>
+          <w:szCs w:val="24"/>
+          <w:lang w:val="en-US"/>
+        </w:rPr>
+        <w:t>Additionally, Administrators can:</w:t>
       </w:r>
     </w:p>
     <w:p>
@@ -8399,7 +8169,7 @@
         <w:pStyle w:val="ListParagraph"/>
         <w:numPr>
           <w:ilvl w:val="0"/>
-          <w:numId w:val="112"/>
+          <w:numId w:val="111"/>
         </w:numPr>
         <w:spacing w:before="240" w:beforeAutospacing="off" w:after="240" w:afterAutospacing="off"/>
         <w:rPr>
@@ -8418,55 +8188,7 @@
           <w:szCs w:val="24"/>
           <w:lang w:val="en-US"/>
         </w:rPr>
-        <w:t>Delete users.</w:t>
-      </w:r>
-    </w:p>
-    <w:p>
-      <w:pPr>
-        <w:pStyle w:val="Heading2"/>
-        <w:spacing w:before="299" w:beforeAutospacing="off" w:after="299" w:afterAutospacing="off"/>
-      </w:pPr>
-      <w:r>
-        <w:rPr>
-          <w:rFonts w:ascii="Arial" w:hAnsi="Arial" w:eastAsia="Arial" w:cs="Arial"/>
-          <w:b w:val="1"/>
-          <w:bCs w:val="1"/>
-          <w:noProof w:val="0"/>
-          <w:sz w:val="36"/>
-          <w:szCs w:val="36"/>
-          <w:lang w:val="en-US"/>
-        </w:rPr>
-        <w:t>Administrator</w:t>
-      </w:r>
-    </w:p>
-    <w:p>
-      <w:pPr>
-        <w:spacing w:before="240" w:beforeAutospacing="off" w:after="240" w:afterAutospacing="off"/>
-      </w:pPr>
-      <w:r>
-        <w:rPr>
-          <w:rFonts w:ascii="Arial" w:hAnsi="Arial" w:eastAsia="Arial" w:cs="Arial"/>
-          <w:noProof w:val="0"/>
-          <w:sz w:val="24"/>
-          <w:szCs w:val="24"/>
-          <w:lang w:val="en-US"/>
-        </w:rPr>
-        <w:t>Can perform everything a Regular User can.</w:t>
-      </w:r>
-    </w:p>
-    <w:p>
-      <w:pPr>
-        <w:spacing w:before="240" w:beforeAutospacing="off" w:after="240" w:afterAutospacing="off"/>
-      </w:pPr>
-      <w:r>
-        <w:rPr>
-          <w:rFonts w:ascii="Arial" w:hAnsi="Arial" w:eastAsia="Arial" w:cs="Arial"/>
-          <w:noProof w:val="0"/>
-          <w:sz w:val="24"/>
-          <w:szCs w:val="24"/>
-          <w:lang w:val="en-US"/>
-        </w:rPr>
-        <w:t>Additionally, Administrators can:</w:t>
+        <w:t>Access Menu Configuration.</w:t>
       </w:r>
     </w:p>
     <w:p>
@@ -8474,7 +8196,7 @@
         <w:pStyle w:val="ListParagraph"/>
         <w:numPr>
           <w:ilvl w:val="0"/>
-          <w:numId w:val="113"/>
+          <w:numId w:val="111"/>
         </w:numPr>
         <w:spacing w:before="240" w:beforeAutospacing="off" w:after="240" w:afterAutospacing="off"/>
         <w:rPr>
@@ -8493,7 +8215,7 @@
           <w:szCs w:val="24"/>
           <w:lang w:val="en-US"/>
         </w:rPr>
-        <w:t>Delete products.</w:t>
+        <w:t>Create, edit, and delete categories.</w:t>
       </w:r>
     </w:p>
     <w:p>
@@ -8501,7 +8223,7 @@
         <w:pStyle w:val="ListParagraph"/>
         <w:numPr>
           <w:ilvl w:val="0"/>
-          <w:numId w:val="113"/>
+          <w:numId w:val="111"/>
         </w:numPr>
         <w:spacing w:before="240" w:beforeAutospacing="off" w:after="240" w:afterAutospacing="off"/>
         <w:rPr>
@@ -8520,7 +8242,7 @@
           <w:szCs w:val="24"/>
           <w:lang w:val="en-US"/>
         </w:rPr>
-        <w:t>Delete categories.</w:t>
+        <w:t>Create, edit, and delete products.</w:t>
       </w:r>
     </w:p>
     <w:p>
@@ -8528,7 +8250,7 @@
         <w:pStyle w:val="ListParagraph"/>
         <w:numPr>
           <w:ilvl w:val="0"/>
-          <w:numId w:val="113"/>
+          <w:numId w:val="111"/>
         </w:numPr>
         <w:spacing w:before="240" w:beforeAutospacing="off" w:after="240" w:afterAutospacing="off"/>
         <w:rPr>
@@ -8547,6 +8269,33 @@
           <w:szCs w:val="24"/>
           <w:lang w:val="en-US"/>
         </w:rPr>
+        <w:t>Change product availability.</w:t>
+      </w:r>
+    </w:p>
+    <w:p>
+      <w:pPr>
+        <w:pStyle w:val="ListParagraph"/>
+        <w:numPr>
+          <w:ilvl w:val="0"/>
+          <w:numId w:val="111"/>
+        </w:numPr>
+        <w:spacing w:before="240" w:beforeAutospacing="off" w:after="240" w:afterAutospacing="off"/>
+        <w:rPr>
+          <w:rFonts w:ascii="Arial" w:hAnsi="Arial" w:eastAsia="Arial" w:cs="Arial"/>
+          <w:noProof w:val="0"/>
+          <w:sz w:val="24"/>
+          <w:szCs w:val="24"/>
+          <w:lang w:val="en-US"/>
+        </w:rPr>
+      </w:pPr>
+      <w:r>
+        <w:rPr>
+          <w:rFonts w:ascii="Arial" w:hAnsi="Arial" w:eastAsia="Arial" w:cs="Arial"/>
+          <w:noProof w:val="0"/>
+          <w:sz w:val="24"/>
+          <w:szCs w:val="24"/>
+          <w:lang w:val="en-US"/>
+        </w:rPr>
         <w:t>Delete users.</w:t>
       </w:r>
     </w:p>
@@ -8565,7 +8314,107 @@
         <w:t>All destructive operations should require confirmation.</w:t>
       </w:r>
     </w:p>
-    <w:p/>
+    <w:p>
+      <w:pPr>
+        <w:spacing w:before="240" w:beforeAutospacing="off" w:after="240" w:afterAutospacing="off"/>
+      </w:pPr>
+      <w:r>
+        <w:rPr>
+          <w:rFonts w:ascii="Arial" w:hAnsi="Arial" w:eastAsia="Arial" w:cs="Arial"/>
+          <w:noProof w:val="0"/>
+          <w:sz w:val="24"/>
+          <w:szCs w:val="24"/>
+          <w:lang w:val="en-US"/>
+        </w:rPr>
+        <w:t>Menu-management permissions must be enforced by the backend. Hiding buttons in the interface is not sufficient security.</w:t>
+      </w:r>
+    </w:p>
+    <w:p>
+      <w:pPr>
+        <w:pStyle w:val="ListParagraph"/>
+        <w:numPr>
+          <w:ilvl w:val="0"/>
+          <w:numId w:val="111"/>
+        </w:numPr>
+        <w:spacing w:before="240" w:beforeAutospacing="off" w:after="240" w:afterAutospacing="off"/>
+        <w:rPr>
+          <w:rFonts w:ascii="Arial" w:hAnsi="Arial" w:eastAsia="Arial" w:cs="Arial"/>
+          <w:noProof w:val="0"/>
+          <w:sz w:val="24"/>
+          <w:szCs w:val="24"/>
+          <w:lang w:val="en-US"/>
+        </w:rPr>
+      </w:pPr>
+      <w:r>
+        <w:rPr>
+          <w:rFonts w:ascii="Arial" w:hAnsi="Arial" w:eastAsia="Arial" w:cs="Arial"/>
+          <w:noProof w:val="0"/>
+          <w:sz w:val="24"/>
+          <w:szCs w:val="24"/>
+          <w:lang w:val="en-US"/>
+        </w:rPr>
+        <w:t>Unauthorized users should receive an appropriate access-denied response.</w:t>
+      </w:r>
+    </w:p>
+    <w:p>
+      <w:pPr>
+        <w:pStyle w:val="ListParagraph"/>
+        <w:numPr>
+          <w:ilvl w:val="0"/>
+          <w:numId w:val="111"/>
+        </w:numPr>
+        <w:spacing w:before="240" w:beforeAutospacing="off" w:after="240" w:afterAutospacing="off"/>
+        <w:rPr>
+          <w:rFonts w:ascii="Arial" w:hAnsi="Arial" w:eastAsia="Arial" w:cs="Arial"/>
+          <w:noProof w:val="0"/>
+          <w:sz w:val="24"/>
+          <w:szCs w:val="24"/>
+          <w:lang w:val="en-US"/>
+        </w:rPr>
+      </w:pPr>
+      <w:r>
+        <w:rPr>
+          <w:rFonts w:ascii="Arial" w:hAnsi="Arial" w:eastAsia="Arial" w:cs="Arial"/>
+          <w:noProof w:val="0"/>
+          <w:sz w:val="24"/>
+          <w:szCs w:val="24"/>
+          <w:lang w:val="en-US"/>
+        </w:rPr>
+        <w:t>Administrative links should not be displayed to Regular Users.</w:t>
+      </w:r>
+    </w:p>
+    <w:p>
+      <w:pPr>
+        <w:pStyle w:val="ListParagraph"/>
+        <w:numPr>
+          <w:ilvl w:val="0"/>
+          <w:numId w:val="111"/>
+        </w:numPr>
+        <w:spacing w:before="240" w:beforeAutospacing="off" w:after="240" w:afterAutospacing="off"/>
+        <w:rPr>
+          <w:rFonts w:ascii="Arial" w:hAnsi="Arial" w:eastAsia="Arial" w:cs="Arial"/>
+          <w:noProof w:val="0"/>
+          <w:sz w:val="24"/>
+          <w:szCs w:val="24"/>
+          <w:lang w:val="en-US"/>
+        </w:rPr>
+      </w:pPr>
+      <w:r>
+        <w:rPr>
+          <w:rFonts w:ascii="Arial" w:hAnsi="Arial" w:eastAsia="Arial" w:cs="Arial"/>
+          <w:noProof w:val="0"/>
+          <w:sz w:val="24"/>
+          <w:szCs w:val="24"/>
+          <w:lang w:val="en-US"/>
+        </w:rPr>
+        <w:t>Backend permissions remain mandatory even if a user manually enters an administrative URL.</w:t>
+      </w:r>
+    </w:p>
+    <w:p>
+      <w:r>
+        <w:t/>
+      </w:r>
+    </w:p>
     <w:p>
       <w:pPr>
         <w:pStyle w:val="Heading1"/>
@@ -10023,46 +9872,6 @@
     </w:p>
     <w:p>
       <w:pPr>
-        <w:pStyle w:val="ListParagraph"/>
-        <w:numPr>
-          <w:ilvl w:val="0"/>
-          <w:numId w:val="78"/>
-        </w:numPr>
-        <w:spacing w:before="240" w:beforeAutospacing="off" w:after="240" w:afterAutospacing="off"/>
-        <w:rPr>
-          <w:rFonts w:ascii="Arial" w:hAnsi="Arial" w:eastAsia="Arial" w:cs="Arial"/>
-          <w:noProof w:val="0"/>
-          <w:sz w:val="24"/>
-          <w:szCs w:val="24"/>
-          <w:lang w:val="en-US"/>
-        </w:rPr>
-      </w:pPr>
-      <w:r>
-        <w:t>Profile.</w:t>
-      </w:r>
-    </w:p>
-    <w:p>
-      <w:pPr>
-        <w:pStyle w:val="ListParagraph"/>
-        <w:numPr>
-          <w:ilvl w:val="0"/>
-          <w:numId w:val="78"/>
-        </w:numPr>
-        <w:spacing w:before="240" w:beforeAutospacing="off" w:after="240" w:afterAutospacing="off"/>
-        <w:rPr>
-          <w:rFonts w:ascii="Arial" w:hAnsi="Arial" w:eastAsia="Arial" w:cs="Arial"/>
-          <w:noProof w:val="0"/>
-          <w:sz w:val="24"/>
-          <w:szCs w:val="24"/>
-          <w:lang w:val="en-US"/>
-        </w:rPr>
-      </w:pPr>
-      <w:r>
-        <w:t>DailyOrderCounter.</w:t>
-      </w:r>
-    </w:p>
-    <w:p>
-      <w:pPr>
         <w:spacing w:before="240" w:beforeAutospacing="off" w:after="240" w:afterAutospacing="off"/>
       </w:pPr>
       <w:r>
@@ -10141,22 +9950,6 @@
         <w:spacing w:before="240" w:beforeAutospacing="off" w:after="240" w:afterAutospacing="off"/>
       </w:pPr>
       <w:r>
-        <w:t>User → has one Profile.</w:t>
-      </w:r>
-    </w:p>
-    <w:p>
-      <w:pPr>
-        <w:spacing w:before="240" w:beforeAutospacing="off" w:after="240" w:afterAutospacing="off"/>
-      </w:pPr>
-      <w:r>
-        <w:t>DailyOrderCounter → maintains the last visible Order Number for each operating date.</w:t>
-      </w:r>
-    </w:p>
-    <w:p>
-      <w:pPr>
-        <w:spacing w:before="240" w:beforeAutospacing="off" w:after="240" w:afterAutospacing="off"/>
-      </w:pPr>
-      <w:r>
         <w:rPr>
           <w:rFonts w:ascii="Arial" w:hAnsi="Arial" w:eastAsia="Arial" w:cs="Arial"/>
           <w:noProof w:val="0"/>
@@ -10315,38 +10108,6 @@
           <w:lang w:val="en-US"/>
         </w:rPr>
         <w:t>Category 1 → N Products.</w:t>
-      </w:r>
-    </w:p>
-    <w:p>
-      <w:pPr>
-        <w:spacing w:before="240" w:beforeAutospacing="off" w:after="240" w:afterAutospacing="off"/>
-      </w:pPr>
-      <w:r>
-        <w:t>Order.id is the permanent internal global identifier and must remain unique across the entire life of the application.</w:t>
-      </w:r>
-    </w:p>
-    <w:p>
-      <w:pPr>
-        <w:spacing w:before="240" w:beforeAutospacing="off" w:after="240" w:afterAutospacing="off"/>
-      </w:pPr>
-      <w:r>
-        <w:t>Order.daily_number is the visible daily Order Number shown to employees and customers.</w:t>
-      </w:r>
-    </w:p>
-    <w:p>
-      <w:pPr>
-        <w:spacing w:before="240" w:beforeAutospacing="off" w:after="240" w:afterAutospacing="off"/>
-      </w:pPr>
-      <w:r>
-        <w:t>Order.operating_date + Order.daily_number must be a unique combination.</w:t>
-      </w:r>
-    </w:p>
-    <w:p>
-      <w:pPr>
-        <w:spacing w:before="240" w:beforeAutospacing="off" w:after="240" w:afterAutospacing="off"/>
-      </w:pPr>
-      <w:r>
-        <w:t>DailyOrderCounter must maintain the last visible Order Number for each operating date and prevent two employees from receiving the same daily number when orders are saved simultaneously.</w:t>
       </w:r>
     </w:p>
     <w:p/>
@@ -10381,22 +10142,6 @@
           <w:lang w:val="en-US"/>
         </w:rPr>
         <w:t>Order history must remain consistent even if menu products change later.</w:t>
-      </w:r>
-    </w:p>
-    <w:p>
-      <w:pPr>
-        <w:spacing w:before="240" w:beforeAutospacing="off" w:after="240" w:afterAutospacing="off"/>
-      </w:pPr>
-      <w:r>
-        <w:t>Orders are historical business records and must not be deleted through the normal administrative panel.</w:t>
-      </w:r>
-    </w:p>
-    <w:p>
-      <w:pPr>
-        <w:spacing w:before="240" w:beforeAutospacing="off" w:after="240" w:afterAutospacing="off"/>
-      </w:pPr>
-      <w:r>
-        <w:t>An order may change status to In Progress, Completed, or Canceled. A Canceled order must remain stored and visible in the order history rather than being deleted.</w:t>
       </w:r>
     </w:p>
     <w:p>

</xml_diff>